<commit_message>
Add independent AI role; rename About -> Résumé
- New position 'AI Engineer & Creator (Independent), junai-labs (2025–Present)'
  on the CV (public docx) and the resume timeline
- Renamed /about -> /resume; nav/footer label now 'Résumé'

Co-Authored-By: Claude Opus 4.8 <noreply@anthropic.com>
</commit_message>
<xml_diff>
--- a/public/Junaid_Shaik_AI_Solutions_Lead_CV.docx
+++ b/public/Junaid_Shaik_AI_Solutions_Lead_CV.docx
@@ -62,7 +62,7 @@
         </w:rPr>
         <w:t xml:space="preserve">   •   </w:t>
       </w:r>
-      <w:hyperlink w:history="1" r:id="rIdahqxz02hwn1ak_py9dh9c">
+      <w:hyperlink w:history="1" r:id="rId0cukvas2s7btebj6sm80w">
         <w:r>
           <w:rPr>
             <w:rStyle w:val="Hyperlink"/>
@@ -80,7 +80,7 @@
         </w:rPr>
         <w:t xml:space="preserve">   •   </w:t>
       </w:r>
-      <w:hyperlink w:history="1" r:id="rIdq7c0iecadp-i7dgbzcbtl">
+      <w:hyperlink w:history="1" r:id="rIdqrbd9zrcn_jon70afblxv">
         <w:r>
           <w:rPr>
             <w:rStyle w:val="Hyperlink"/>
@@ -644,6 +644,132 @@
           <w:szCs w:val="24"/>
         </w:rPr>
         <w:t xml:space="preserve">PROFESSIONAL EXPERIENCE</w:t>
+      </w:r>
+    </w:p>
+    <w:p>
+      <w:pPr>
+        <w:tabs>
+          <w:tab w:val="right" w:pos="9026"/>
+        </w:tabs>
+        <w:spacing w:after="0" w:before="160"/>
+      </w:pPr>
+      <w:r>
+        <w:rPr>
+          <w:b/>
+          <w:bCs/>
+          <w:color w:val="222222"/>
+          <w:sz w:val="22"/>
+          <w:szCs w:val="22"/>
+        </w:rPr>
+        <w:t xml:space="preserve">AI Engineer &amp; Creator (Independent)</w:t>
+      </w:r>
+      <w:r>
+        <w:rPr>
+          <w:color w:val="555555"/>
+          <w:sz w:val="18"/>
+          <w:szCs w:val="18"/>
+        </w:rPr>
+        <w:t xml:space="preserve">	2025 – Present</w:t>
+      </w:r>
+    </w:p>
+    <w:p>
+      <w:pPr>
+        <w:tabs>
+          <w:tab w:val="right" w:pos="9026"/>
+        </w:tabs>
+        <w:spacing w:after="80"/>
+      </w:pPr>
+      <w:r>
+        <w:rPr>
+          <w:b/>
+          <w:bCs/>
+          <w:color w:val="0E5A6B"/>
+          <w:sz w:val="20"/>
+          <w:szCs w:val="20"/>
+        </w:rPr>
+        <w:t xml:space="preserve">junai-labs</w:t>
+      </w:r>
+      <w:r>
+        <w:rPr>
+          <w:i/>
+          <w:iCs/>
+          <w:color w:val="555555"/>
+          <w:sz w:val="18"/>
+          <w:szCs w:val="18"/>
+        </w:rPr>
+        <w:t xml:space="preserve">	Limerick, Ireland</w:t>
+      </w:r>
+    </w:p>
+    <w:p>
+      <w:pPr>
+        <w:pStyle w:val="ListParagraph"/>
+        <w:numPr>
+          <w:ilvl w:val="0"/>
+          <w:numId w:val="2"/>
+        </w:numPr>
+        <w:spacing w:after="60"/>
+      </w:pPr>
+      <w:r>
+        <w:rPr>
+          <w:color w:val="222222"/>
+          <w:sz w:val="20"/>
+          <w:szCs w:val="20"/>
+        </w:rPr>
+        <w:t xml:space="preserve">Design, build and publish agentic AI developer tools to the VS Code and Claude Code marketplaces — junai, ptarmigan and claudster.</w:t>
+      </w:r>
+    </w:p>
+    <w:p>
+      <w:pPr>
+        <w:pStyle w:val="ListParagraph"/>
+        <w:numPr>
+          <w:ilvl w:val="0"/>
+          <w:numId w:val="2"/>
+        </w:numPr>
+        <w:spacing w:after="60"/>
+      </w:pPr>
+      <w:r>
+        <w:rPr>
+          <w:color w:val="222222"/>
+          <w:sz w:val="20"/>
+          <w:szCs w:val="20"/>
+        </w:rPr>
+        <w:t xml:space="preserve">Engineer multi-agent pipelines on the Model Context Protocol (MCP) with specialist agents, deterministic routing and TDD-enforced quality gates.</w:t>
+      </w:r>
+    </w:p>
+    <w:p>
+      <w:pPr>
+        <w:pStyle w:val="ListParagraph"/>
+        <w:numPr>
+          <w:ilvl w:val="0"/>
+          <w:numId w:val="2"/>
+        </w:numPr>
+        <w:spacing w:after="60"/>
+      </w:pPr>
+      <w:r>
+        <w:rPr>
+          <w:color w:val="222222"/>
+          <w:sz w:val="20"/>
+          <w:szCs w:val="20"/>
+        </w:rPr>
+        <w:t xml:space="preserve">Built a model-portable LiteLLM gateway that runs the same agents on cloud or on-prem open-source LLMs (vLLM / Ollama — Qwen, Mistral, GLM).</w:t>
+      </w:r>
+    </w:p>
+    <w:p>
+      <w:pPr>
+        <w:pStyle w:val="ListParagraph"/>
+        <w:numPr>
+          <w:ilvl w:val="0"/>
+          <w:numId w:val="2"/>
+        </w:numPr>
+        <w:spacing w:after="60"/>
+      </w:pPr>
+      <w:r>
+        <w:rPr>
+          <w:color w:val="222222"/>
+          <w:sz w:val="20"/>
+          <w:szCs w:val="20"/>
+        </w:rPr>
+        <w:t xml:space="preserve">Apply RAG, prompt engineering and end-to-end LLM integration patterns across the toolchain.</w:t>
       </w:r>
     </w:p>
     <w:p>

</xml_diff>

<commit_message>
Reframe new role as Founding Member, AI Solutions Vertical (VMIE)
- CV + resume timeline: 'Founding Member — AI Solutions Vertical',
  Virgin Media Ireland (2025–Present)
- De-duplicated AI bullets from the Lead Solutions Architect entry

Co-Authored-By: Claude Opus 4.8 <noreply@anthropic.com>
</commit_message>
<xml_diff>
--- a/public/Junaid_Shaik_AI_Solutions_Lead_CV.docx
+++ b/public/Junaid_Shaik_AI_Solutions_Lead_CV.docx
@@ -62,7 +62,7 @@
         </w:rPr>
         <w:t xml:space="preserve">   •   </w:t>
       </w:r>
-      <w:hyperlink w:history="1" r:id="rId0cukvas2s7btebj6sm80w">
+      <w:hyperlink w:history="1" r:id="rIdlo6zwawc8_d2p39ju3m1x">
         <w:r>
           <w:rPr>
             <w:rStyle w:val="Hyperlink"/>
@@ -80,7 +80,7 @@
         </w:rPr>
         <w:t xml:space="preserve">   •   </w:t>
       </w:r>
-      <w:hyperlink w:history="1" r:id="rIdqrbd9zrcn_jon70afblxv">
+      <w:hyperlink w:history="1" r:id="rIdg9fsy6xcqepxc2seomjex">
         <w:r>
           <w:rPr>
             <w:rStyle w:val="Hyperlink"/>
@@ -661,7 +661,7 @@
           <w:sz w:val="22"/>
           <w:szCs w:val="22"/>
         </w:rPr>
-        <w:t xml:space="preserve">AI Engineer &amp; Creator (Independent)</w:t>
+        <w:t xml:space="preserve">Founding Member — AI Solutions Vertical</w:t>
       </w:r>
       <w:r>
         <w:rPr>
@@ -687,7 +687,7 @@
           <w:sz w:val="20"/>
           <w:szCs w:val="20"/>
         </w:rPr>
-        <w:t xml:space="preserve">junai-labs</w:t>
+        <w:t xml:space="preserve">Virgin Media Ireland</w:t>
       </w:r>
       <w:r>
         <w:rPr>
@@ -715,61 +715,61 @@
           <w:sz w:val="20"/>
           <w:szCs w:val="20"/>
         </w:rPr>
-        <w:t xml:space="preserve">Design, build and publish agentic AI developer tools to the VS Code and Claude Code marketplaces — junai, ptarmigan and claudster.</w:t>
-      </w:r>
-    </w:p>
-    <w:p>
-      <w:pPr>
-        <w:pStyle w:val="ListParagraph"/>
-        <w:numPr>
-          <w:ilvl w:val="0"/>
-          <w:numId w:val="2"/>
-        </w:numPr>
-        <w:spacing w:after="60"/>
-      </w:pPr>
-      <w:r>
-        <w:rPr>
-          <w:color w:val="222222"/>
-          <w:sz w:val="20"/>
-          <w:szCs w:val="20"/>
-        </w:rPr>
-        <w:t xml:space="preserve">Engineer multi-agent pipelines on the Model Context Protocol (MCP) with specialist agents, deterministic routing and TDD-enforced quality gates.</w:t>
-      </w:r>
-    </w:p>
-    <w:p>
-      <w:pPr>
-        <w:pStyle w:val="ListParagraph"/>
-        <w:numPr>
-          <w:ilvl w:val="0"/>
-          <w:numId w:val="2"/>
-        </w:numPr>
-        <w:spacing w:after="60"/>
-      </w:pPr>
-      <w:r>
-        <w:rPr>
-          <w:color w:val="222222"/>
-          <w:sz w:val="20"/>
-          <w:szCs w:val="20"/>
-        </w:rPr>
-        <w:t xml:space="preserve">Built a model-portable LiteLLM gateway that runs the same agents on cloud or on-prem open-source LLMs (vLLM / Ollama — Qwen, Mistral, GLM).</w:t>
-      </w:r>
-    </w:p>
-    <w:p>
-      <w:pPr>
-        <w:pStyle w:val="ListParagraph"/>
-        <w:numPr>
-          <w:ilvl w:val="0"/>
-          <w:numId w:val="2"/>
-        </w:numPr>
-        <w:spacing w:after="60"/>
-      </w:pPr>
-      <w:r>
-        <w:rPr>
-          <w:color w:val="222222"/>
-          <w:sz w:val="20"/>
-          <w:szCs w:val="20"/>
-        </w:rPr>
-        <w:t xml:space="preserve">Apply RAG, prompt engineering and end-to-end LLM integration patterns across the toolchain.</w:t>
+        <w:t xml:space="preserve">Founding and core member of Virgin Media Ireland's AI Solutions vertical — shaping enterprise AI strategy, governance and value-creation frameworks, and enabling scalable AI use cases across business units.</w:t>
+      </w:r>
+    </w:p>
+    <w:p>
+      <w:pPr>
+        <w:pStyle w:val="ListParagraph"/>
+        <w:numPr>
+          <w:ilvl w:val="0"/>
+          <w:numId w:val="2"/>
+        </w:numPr>
+        <w:spacing w:after="60"/>
+      </w:pPr>
+      <w:r>
+        <w:rPr>
+          <w:color w:val="222222"/>
+          <w:sz w:val="20"/>
+          <w:szCs w:val="20"/>
+        </w:rPr>
+        <w:t xml:space="preserve">Lead the design and delivery of production Generative AI platforms — contact-centre AI assistants, RAG-based customer intelligence and AI-driven field dispatch.</w:t>
+      </w:r>
+    </w:p>
+    <w:p>
+      <w:pPr>
+        <w:pStyle w:val="ListParagraph"/>
+        <w:numPr>
+          <w:ilvl w:val="0"/>
+          <w:numId w:val="2"/>
+        </w:numPr>
+        <w:spacing w:after="60"/>
+      </w:pPr>
+      <w:r>
+        <w:rPr>
+          <w:color w:val="222222"/>
+          <w:sz w:val="20"/>
+          <w:szCs w:val="20"/>
+        </w:rPr>
+        <w:t xml:space="preserve">Define enterprise standards for LLM integration, retrieval-augmented generation, agentic (MCP) systems and hybrid cloud / on-prem model serving.</w:t>
+      </w:r>
+    </w:p>
+    <w:p>
+      <w:pPr>
+        <w:pStyle w:val="ListParagraph"/>
+        <w:numPr>
+          <w:ilvl w:val="0"/>
+          <w:numId w:val="2"/>
+        </w:numPr>
+        <w:spacing w:after="60"/>
+      </w:pPr>
+      <w:r>
+        <w:rPr>
+          <w:color w:val="222222"/>
+          <w:sz w:val="20"/>
+          <w:szCs w:val="20"/>
+        </w:rPr>
+        <w:t xml:space="preserve">Mentor architects and engineers and remove delivery blockers, moving operations from reactive to predictive, automated workflows.</w:t>
       </w:r>
     </w:p>
     <w:p>
@@ -824,42 +824,6 @@
           <w:szCs w:val="18"/>
         </w:rPr>
         <w:t xml:space="preserve">	Limerick, Ireland</w:t>
-      </w:r>
-    </w:p>
-    <w:p>
-      <w:pPr>
-        <w:pStyle w:val="ListParagraph"/>
-        <w:numPr>
-          <w:ilvl w:val="0"/>
-          <w:numId w:val="2"/>
-        </w:numPr>
-        <w:spacing w:after="60"/>
-      </w:pPr>
-      <w:r>
-        <w:rPr>
-          <w:color w:val="222222"/>
-          <w:sz w:val="20"/>
-          <w:szCs w:val="20"/>
-        </w:rPr>
-        <w:t xml:space="preserve">Key member of the AI Solutions Leadership Team — shaping data and AI strategy, defining AI value-creation frameworks, and enabling scalable AI use cases across the enterprise.</w:t>
-      </w:r>
-    </w:p>
-    <w:p>
-      <w:pPr>
-        <w:pStyle w:val="ListParagraph"/>
-        <w:numPr>
-          <w:ilvl w:val="0"/>
-          <w:numId w:val="2"/>
-        </w:numPr>
-        <w:spacing w:after="60"/>
-      </w:pPr>
-      <w:r>
-        <w:rPr>
-          <w:color w:val="222222"/>
-          <w:sz w:val="20"/>
-          <w:szCs w:val="20"/>
-        </w:rPr>
-        <w:t xml:space="preserve">Lead the design and delivery of the AI-driven platforms above, moving contact-centre and field operations from reactive to predictive, automated workflows.</w:t>
       </w:r>
     </w:p>
     <w:p>

</xml_diff>

<commit_message>
Rename AI role to Founding Member — AI Centre of Excellence (CoE)
Co-Authored-By: Claude Opus 4.8 <noreply@anthropic.com>
</commit_message>
<xml_diff>
--- a/public/Junaid_Shaik_AI_Solutions_Lead_CV.docx
+++ b/public/Junaid_Shaik_AI_Solutions_Lead_CV.docx
@@ -62,7 +62,7 @@
         </w:rPr>
         <w:t xml:space="preserve">   •   </w:t>
       </w:r>
-      <w:hyperlink w:history="1" r:id="rIdlo6zwawc8_d2p39ju3m1x">
+      <w:hyperlink w:history="1" r:id="rIdmfwpmsq0n6zmrkpki-bvl">
         <w:r>
           <w:rPr>
             <w:rStyle w:val="Hyperlink"/>
@@ -80,7 +80,7 @@
         </w:rPr>
         <w:t xml:space="preserve">   •   </w:t>
       </w:r>
-      <w:hyperlink w:history="1" r:id="rIdg9fsy6xcqepxc2seomjex">
+      <w:hyperlink w:history="1" r:id="rIduhk1sqker2mbu6na9dt9x">
         <w:r>
           <w:rPr>
             <w:rStyle w:val="Hyperlink"/>
@@ -661,7 +661,7 @@
           <w:sz w:val="22"/>
           <w:szCs w:val="22"/>
         </w:rPr>
-        <w:t xml:space="preserve">Founding Member — AI Solutions Vertical</w:t>
+        <w:t xml:space="preserve">Founding Member — AI Centre of Excellence (CoE)</w:t>
       </w:r>
       <w:r>
         <w:rPr>
@@ -715,7 +715,7 @@
           <w:sz w:val="20"/>
           <w:szCs w:val="20"/>
         </w:rPr>
-        <w:t xml:space="preserve">Founding and core member of Virgin Media Ireland's AI Solutions vertical — shaping enterprise AI strategy, governance and value-creation frameworks, and enabling scalable AI use cases across business units.</w:t>
+        <w:t xml:space="preserve">Founding and core member of Virgin Media Ireland's AI Centre of Excellence — shaping enterprise AI strategy, governance and value-creation frameworks, and enabling scalable AI use cases across business units.</w:t>
       </w:r>
     </w:p>
     <w:p>

</xml_diff>

<commit_message>
Retitle AI role to Core Member — AI Centre of Excellence
Drop 'founding' wording across CV, resume timeline, and bio.

Co-Authored-By: Claude Opus 4.8 <noreply@anthropic.com>
</commit_message>
<xml_diff>
--- a/public/Junaid_Shaik_AI_Solutions_Lead_CV.docx
+++ b/public/Junaid_Shaik_AI_Solutions_Lead_CV.docx
@@ -62,7 +62,7 @@
         </w:rPr>
         <w:t xml:space="preserve">   •   </w:t>
       </w:r>
-      <w:hyperlink w:history="1" r:id="rIdmfwpmsq0n6zmrkpki-bvl">
+      <w:hyperlink w:history="1" r:id="rIdmvpro2yr6fliq7hhdfogn">
         <w:r>
           <w:rPr>
             <w:rStyle w:val="Hyperlink"/>
@@ -80,7 +80,7 @@
         </w:rPr>
         <w:t xml:space="preserve">   •   </w:t>
       </w:r>
-      <w:hyperlink w:history="1" r:id="rIduhk1sqker2mbu6na9dt9x">
+      <w:hyperlink w:history="1" r:id="rIdbdtxkapczwtyyf6ym5dwy">
         <w:r>
           <w:rPr>
             <w:rStyle w:val="Hyperlink"/>
@@ -661,7 +661,7 @@
           <w:sz w:val="22"/>
           <w:szCs w:val="22"/>
         </w:rPr>
-        <w:t xml:space="preserve">Founding Member — AI Centre of Excellence (CoE)</w:t>
+        <w:t xml:space="preserve">Core Member — AI Centre of Excellence (CoE)</w:t>
       </w:r>
       <w:r>
         <w:rPr>
@@ -715,7 +715,7 @@
           <w:sz w:val="20"/>
           <w:szCs w:val="20"/>
         </w:rPr>
-        <w:t xml:space="preserve">Founding and core member of Virgin Media Ireland's AI Centre of Excellence — shaping enterprise AI strategy, governance and value-creation frameworks, and enabling scalable AI use cases across business units.</w:t>
+        <w:t xml:space="preserve">Core member of Virgin Media Ireland's AI Centre of Excellence since its inception — shaping enterprise AI strategy, governance and value-creation frameworks, and enabling scalable AI use cases across business units.</w:t>
       </w:r>
     </w:p>
     <w:p>

</xml_diff>

<commit_message>
Enhance CV: portfolio + LinkedIn links, richer summary and earlier roles
Co-Authored-By: Claude Opus 4.8 <noreply@anthropic.com>
</commit_message>
<xml_diff>
--- a/public/Junaid_Shaik_AI_Solutions_Lead_CV.docx
+++ b/public/Junaid_Shaik_AI_Solutions_Lead_CV.docx
@@ -33,10 +33,7 @@
     </w:p>
     <w:p>
       <w:pPr>
-        <w:pBdr>
-          <w:bottom w:val="single" w:color="BBBBBB" w:sz="4" w:space="6"/>
-        </w:pBdr>
-        <w:spacing w:after="0"/>
+        <w:spacing w:after="30"/>
       </w:pPr>
       <w:r>
         <w:rPr>
@@ -62,7 +59,7 @@
         </w:rPr>
         <w:t xml:space="preserve">   •   </w:t>
       </w:r>
-      <w:hyperlink w:history="1" r:id="rIdmvpro2yr6fliq7hhdfogn">
+      <w:hyperlink w:history="1" r:id="rIdgqn9q2khmqgwfalbkplyh">
         <w:r>
           <w:rPr>
             <w:rStyle w:val="Hyperlink"/>
@@ -72,15 +69,61 @@
           <w:t xml:space="preserve">saajunaid@gmail.com</w:t>
         </w:r>
       </w:hyperlink>
-      <w:r>
-        <w:rPr>
+    </w:p>
+    <w:p>
+      <w:pPr>
+        <w:pBdr>
+          <w:bottom w:val="single" w:color="BBBBBB" w:sz="4" w:space="6"/>
+        </w:pBdr>
+        <w:spacing w:after="0"/>
+      </w:pPr>
+      <w:r>
+        <w:rPr>
+          <w:b/>
+          <w:bCs/>
           <w:color w:val="555555"/>
           <w:sz w:val="18"/>
           <w:szCs w:val="18"/>
         </w:rPr>
-        <w:t xml:space="preserve">   •   </w:t>
-      </w:r>
-      <w:hyperlink w:history="1" r:id="rIdbdtxkapczwtyyf6ym5dwy">
+        <w:t xml:space="preserve">Portfolio: </w:t>
+      </w:r>
+      <w:hyperlink w:history="1" r:id="rIdxzggfrmk2jrx0198kons3">
+        <w:r>
+          <w:rPr>
+            <w:rStyle w:val="Hyperlink"/>
+            <w:sz w:val="18"/>
+            <w:szCs w:val="18"/>
+          </w:rPr>
+          <w:t xml:space="preserve">jun-ai-d.vercel.app</w:t>
+        </w:r>
+      </w:hyperlink>
+      <w:r>
+        <w:rPr>
+          <w:color w:val="555555"/>
+          <w:sz w:val="18"/>
+          <w:szCs w:val="18"/>
+        </w:rPr>
+        <w:t xml:space="preserve">   •   LinkedIn: </w:t>
+      </w:r>
+      <w:hyperlink w:history="1" r:id="rIdhd4euoxde-on_fdvkskfa">
+        <w:r>
+          <w:rPr>
+            <w:rStyle w:val="Hyperlink"/>
+            <w:sz w:val="18"/>
+            <w:szCs w:val="18"/>
+          </w:rPr>
+          <w:t xml:space="preserve">in/junaid-shaik</w:t>
+        </w:r>
+      </w:hyperlink>
+      <w:r>
+        <w:rPr>
+          <w:color w:val="555555"/>
+          <w:sz w:val="18"/>
+          <w:szCs w:val="18"/>
+        </w:rPr>
+        <w:t xml:space="preserve">   •   GitHub: </w:t>
+      </w:r>
+      <w:hyperlink w:history="1" r:id="rIdqwbm50in6q42dywrrko-h">
         <w:r>
           <w:rPr>
             <w:rStyle w:val="Hyperlink"/>
@@ -121,7 +164,7 @@
           <w:sz w:val="20"/>
           <w:szCs w:val="20"/>
         </w:rPr>
-        <w:t xml:space="preserve">Solutions &amp; AI Architect with 15+ years across telecom and technology, now focused on enterprise Generative AI. Designs and ships production AI systems end to end — LLM integration across cloud and on-prem models, retrieval-augmented generation, and agentic architectures (MCP and multi-agent pipelines) — grounded in deep BSS/OSS, network, and cloud experience. TOGAF-certified and AWS AI Practitioner, with a proven record of translating strategy into scalable, secure, business-impacting platforms and leading cross-functional delivery.</w:t>
+        <w:t xml:space="preserve">Solutions &amp; AI Architect with 15+ years across telecom and technology, now leading enterprise Generative AI. Designs and ships production AI end to end — LLM integration across cloud and on-prem models, retrieval-augmented generation, and agentic systems (MCP and multi-agent pipelines) — on a foundation of deep BSS/OSS, network and cloud architecture. Core member of an AI Centre of Excellence, architect of a €200M fibre transformation serving 1M+ customers, and creator of three published AI developer tools. TOGAF-certified and AWS AI Practitioner; known for turning strategy into scalable, secure, business-impacting platforms and leading cross-functional delivery from concept to production.</w:t>
       </w:r>
     </w:p>
     <w:p>
@@ -985,43 +1028,79 @@
           <w:sz w:val="20"/>
           <w:szCs w:val="20"/>
         </w:rPr>
-        <w:t xml:space="preserve">Led B2B CPE architecture (DOCSIS 3.0/3.1, Intel SDK) across the UK and Pan-EU footprint.</w:t>
-      </w:r>
-    </w:p>
-    <w:p>
-      <w:pPr>
-        <w:pStyle w:val="ListParagraph"/>
-        <w:numPr>
-          <w:ilvl w:val="0"/>
-          <w:numId w:val="2"/>
-        </w:numPr>
-        <w:spacing w:after="60"/>
-      </w:pPr>
-      <w:r>
-        <w:rPr>
-          <w:color w:val="222222"/>
-          <w:sz w:val="20"/>
-          <w:szCs w:val="20"/>
-        </w:rPr>
-        <w:t xml:space="preserve">Identified and resolved an Intel SDK security vulnerability during manufacturing, saving several million euros and designing a strategic mitigation plan.</w:t>
-      </w:r>
-    </w:p>
-    <w:p>
-      <w:pPr>
-        <w:pStyle w:val="ListParagraph"/>
-        <w:numPr>
-          <w:ilvl w:val="0"/>
-          <w:numId w:val="2"/>
-        </w:numPr>
-        <w:spacing w:after="60"/>
-      </w:pPr>
-      <w:r>
-        <w:rPr>
-          <w:color w:val="222222"/>
-          <w:sz w:val="20"/>
-          <w:szCs w:val="20"/>
-        </w:rPr>
-        <w:t xml:space="preserve">Negotiated vendor terms and delivery timelines (Intel, Hitron), reviewed Statements of Work, and presented strategic plans to Directors and VPs.</w:t>
+        <w:t xml:space="preserve">Led the B2B CPE architecture team delivering DOCSIS 3.0/3.1 Intel SDK platforms across the UK and Pan-EU footprint, driving innovation and scalability.</w:t>
+      </w:r>
+    </w:p>
+    <w:p>
+      <w:pPr>
+        <w:pStyle w:val="ListParagraph"/>
+        <w:numPr>
+          <w:ilvl w:val="0"/>
+          <w:numId w:val="2"/>
+        </w:numPr>
+        <w:spacing w:after="60"/>
+      </w:pPr>
+      <w:r>
+        <w:rPr>
+          <w:color w:val="222222"/>
+          <w:sz w:val="20"/>
+          <w:szCs w:val="20"/>
+        </w:rPr>
+        <w:t xml:space="preserve">Identified and resolved an Intel SDK security vulnerability during DOCSIS 3.1 CPE manufacturing, saving several million euros and designing a strategic mitigation plan to future-proof operations.</w:t>
+      </w:r>
+    </w:p>
+    <w:p>
+      <w:pPr>
+        <w:pStyle w:val="ListParagraph"/>
+        <w:numPr>
+          <w:ilvl w:val="0"/>
+          <w:numId w:val="2"/>
+        </w:numPr>
+        <w:spacing w:after="60"/>
+      </w:pPr>
+      <w:r>
+        <w:rPr>
+          <w:color w:val="222222"/>
+          <w:sz w:val="20"/>
+          <w:szCs w:val="20"/>
+        </w:rPr>
+        <w:t xml:space="preserve">Represented the B2B architecture team in vendor negotiations (Intel, Hitron), securing favourable terms; reviewed Statements of Work and quotations to validate budget efficiency and ROI.</w:t>
+      </w:r>
+    </w:p>
+    <w:p>
+      <w:pPr>
+        <w:pStyle w:val="ListParagraph"/>
+        <w:numPr>
+          <w:ilvl w:val="0"/>
+          <w:numId w:val="2"/>
+        </w:numPr>
+        <w:spacing w:after="60"/>
+      </w:pPr>
+      <w:r>
+        <w:rPr>
+          <w:color w:val="222222"/>
+          <w:sz w:val="20"/>
+          <w:szCs w:val="20"/>
+        </w:rPr>
+        <w:t xml:space="preserve">Delivered high-value features such as Mobile Backup across affiliate markets (Poland, Switzerland, Hungary, UK), increasing customer satisfaction and service value.</w:t>
+      </w:r>
+    </w:p>
+    <w:p>
+      <w:pPr>
+        <w:pStyle w:val="ListParagraph"/>
+        <w:numPr>
+          <w:ilvl w:val="0"/>
+          <w:numId w:val="2"/>
+        </w:numPr>
+        <w:spacing w:after="60"/>
+      </w:pPr>
+      <w:r>
+        <w:rPr>
+          <w:color w:val="222222"/>
+          <w:sz w:val="20"/>
+          <w:szCs w:val="20"/>
+        </w:rPr>
+        <w:t xml:space="preserve">Managed global onshore/offshore testing teams and presented value-driven technical plans to Directors and VPs, securing buy-in for strategic initiatives.</w:t>
       </w:r>
     </w:p>
     <w:p>
@@ -1093,25 +1172,61 @@
           <w:sz w:val="20"/>
           <w:szCs w:val="20"/>
         </w:rPr>
-        <w:t xml:space="preserve">Built automation frameworks for global CPE certification and represented Liberty Global in the RDK-B / TDK-B standards forum.</w:t>
-      </w:r>
-    </w:p>
-    <w:p>
-      <w:pPr>
-        <w:pStyle w:val="ListParagraph"/>
-        <w:numPr>
-          <w:ilvl w:val="0"/>
-          <w:numId w:val="2"/>
-        </w:numPr>
-        <w:spacing w:after="60"/>
-      </w:pPr>
-      <w:r>
-        <w:rPr>
-          <w:color w:val="222222"/>
-          <w:sz w:val="20"/>
-          <w:szCs w:val="20"/>
-        </w:rPr>
-        <w:t xml:space="preserve">Defined test strategies and roadmaps with partners, ensuring successful Country Validation across the footprint.</w:t>
+        <w:t xml:space="preserve">Key contributor to the Global Connectivity Test Execution &amp; Automation team; built automation frameworks (including Bootfile Change validation) that delivered significant time and resource savings.</w:t>
+      </w:r>
+    </w:p>
+    <w:p>
+      <w:pPr>
+        <w:pStyle w:val="ListParagraph"/>
+        <w:numPr>
+          <w:ilvl w:val="0"/>
+          <w:numId w:val="2"/>
+        </w:numPr>
+        <w:spacing w:after="60"/>
+      </w:pPr>
+      <w:r>
+        <w:rPr>
+          <w:color w:val="222222"/>
+          <w:sz w:val="20"/>
+          <w:szCs w:val="20"/>
+        </w:rPr>
+        <w:t xml:space="preserve">Defined test strategies and roadmaps with external partners and represented Liberty Global in the RDK-B / TDK-B standards forum, influencing product vision and deployment strategy.</w:t>
+      </w:r>
+    </w:p>
+    <w:p>
+      <w:pPr>
+        <w:pStyle w:val="ListParagraph"/>
+        <w:numPr>
+          <w:ilvl w:val="0"/>
+          <w:numId w:val="2"/>
+        </w:numPr>
+        <w:spacing w:after="60"/>
+      </w:pPr>
+      <w:r>
+        <w:rPr>
+          <w:color w:val="222222"/>
+          <w:sz w:val="20"/>
+          <w:szCs w:val="20"/>
+        </w:rPr>
+        <w:t xml:space="preserve">Established and managed a centralised modem farm in Ireland, enabling remote diagnostics and telemetry collection for central deployment teams.</w:t>
+      </w:r>
+    </w:p>
+    <w:p>
+      <w:pPr>
+        <w:pStyle w:val="ListParagraph"/>
+        <w:numPr>
+          <w:ilvl w:val="0"/>
+          <w:numId w:val="2"/>
+        </w:numPr>
+        <w:spacing w:after="60"/>
+      </w:pPr>
+      <w:r>
+        <w:rPr>
+          <w:color w:val="222222"/>
+          <w:sz w:val="20"/>
+          <w:szCs w:val="20"/>
+        </w:rPr>
+        <w:t xml:space="preserve">Provided expert-level support to local OpCo Residential and B2B operations and delivered training programmes, ensuring successful Country Validation across the footprint.</w:t>
       </w:r>
     </w:p>
     <w:p>
@@ -1183,7 +1298,61 @@
           <w:sz w:val="20"/>
           <w:szCs w:val="20"/>
         </w:rPr>
-        <w:t xml:space="preserve">Led the introduction of the Mv1 cable modem to the Irish market; provided 3rd-tier support across ARM/ATOM and Broadcom/PUMA chipsets and led UAT with OSS/BSS teams.</w:t>
+        <w:t xml:space="preserve">Led the introduction and deployment of the Mv1 cable modem in the Irish market, managing testing and rollout of new products and services across the VMIE footprint.</w:t>
+      </w:r>
+    </w:p>
+    <w:p>
+      <w:pPr>
+        <w:pStyle w:val="ListParagraph"/>
+        <w:numPr>
+          <w:ilvl w:val="0"/>
+          <w:numId w:val="2"/>
+        </w:numPr>
+        <w:spacing w:after="60"/>
+      </w:pPr>
+      <w:r>
+        <w:rPr>
+          <w:color w:val="222222"/>
+          <w:sz w:val="20"/>
+          <w:szCs w:val="20"/>
+        </w:rPr>
+        <w:t xml:space="preserve">Provided expert 3rd-tier support — troubleshooting ARM/ATOM processors, Broadcom/PUMA chipsets and WiFi features through log analysis, root-cause investigation and configuration updates.</w:t>
+      </w:r>
+    </w:p>
+    <w:p>
+      <w:pPr>
+        <w:pStyle w:val="ListParagraph"/>
+        <w:numPr>
+          <w:ilvl w:val="0"/>
+          <w:numId w:val="2"/>
+        </w:numPr>
+        <w:spacing w:after="60"/>
+      </w:pPr>
+      <w:r>
+        <w:rPr>
+          <w:color w:val="222222"/>
+          <w:sz w:val="20"/>
+          <w:szCs w:val="20"/>
+        </w:rPr>
+        <w:t xml:space="preserve">Resolved complex customer issues via on-site investigation and lab prototype recreation with engineering teams; managed CPE projects with the PMO and led UAT with OSS/BSS teams.</w:t>
+      </w:r>
+    </w:p>
+    <w:p>
+      <w:pPr>
+        <w:pStyle w:val="ListParagraph"/>
+        <w:numPr>
+          <w:ilvl w:val="0"/>
+          <w:numId w:val="2"/>
+        </w:numPr>
+        <w:spacing w:after="60"/>
+      </w:pPr>
+      <w:r>
+        <w:rPr>
+          <w:color w:val="222222"/>
+          <w:sz w:val="20"/>
+          <w:szCs w:val="20"/>
+        </w:rPr>
+        <w:t xml:space="preserve">Mentored team members and delivered technical training to internal teams and external stakeholders.</w:t>
       </w:r>
     </w:p>
     <w:p>
@@ -1255,7 +1424,43 @@
           <w:sz w:val="20"/>
           <w:szCs w:val="20"/>
         </w:rPr>
-        <w:t xml:space="preserve">NOC monitoring and fault-trend analysis for broadband, VoIP and SIP, preventing critical outages; mentored and led the technical support desk.</w:t>
+        <w:t xml:space="preserve">Grew the Technical Support Desk over five years as a subject-matter expert, leading, training and mentoring new team members.</w:t>
+      </w:r>
+    </w:p>
+    <w:p>
+      <w:pPr>
+        <w:pStyle w:val="ListParagraph"/>
+        <w:numPr>
+          <w:ilvl w:val="0"/>
+          <w:numId w:val="2"/>
+        </w:numPr>
+        <w:spacing w:after="60"/>
+      </w:pPr>
+      <w:r>
+        <w:rPr>
+          <w:color w:val="222222"/>
+          <w:sz w:val="20"/>
+          <w:szCs w:val="20"/>
+        </w:rPr>
+        <w:t xml:space="preserve">Delivered proactive technical solutions and fault-trend analysis for broadband, VoIP and SIP, preventing critical network outages; monitored nationwide networks as part of the NOC.</w:t>
+      </w:r>
+    </w:p>
+    <w:p>
+      <w:pPr>
+        <w:pStyle w:val="ListParagraph"/>
+        <w:numPr>
+          <w:ilvl w:val="0"/>
+          <w:numId w:val="2"/>
+        </w:numPr>
+        <w:spacing w:after="60"/>
+      </w:pPr>
+      <w:r>
+        <w:rPr>
+          <w:color w:val="222222"/>
+          <w:sz w:val="20"/>
+          <w:szCs w:val="20"/>
+        </w:rPr>
+        <w:t xml:space="preserve">Acted as Team Leader in the absence of senior staff and primary escalation contact across departments, resolving technical queries within defined SLAs.</w:t>
       </w:r>
     </w:p>
     <w:p>

</xml_diff>

<commit_message>
Remove AI-typography (em/en-dashes, arrows, middots) from CV
Single generator now outputs a 2-page and a detailed 3-page version,
both with human-natural punctuation.

Co-Authored-By: Claude Opus 4.8 <noreply@anthropic.com>
</commit_message>
<xml_diff>
--- a/public/Junaid_Shaik_AI_Solutions_Lead_CV.docx
+++ b/public/Junaid_Shaik_AI_Solutions_Lead_CV.docx
@@ -49,17 +49,9 @@
           <w:sz w:val="17"/>
           <w:szCs w:val="17"/>
         </w:rPr>
-        <w:t xml:space="preserve">   •   +353 85 887 3672</w:t>
-      </w:r>
-      <w:r>
-        <w:rPr>
-          <w:color w:val="555555"/>
-          <w:sz w:val="17"/>
-          <w:szCs w:val="17"/>
-        </w:rPr>
-        <w:t xml:space="preserve">   •   </w:t>
-      </w:r>
-      <w:hyperlink w:history="1" r:id="rId8fiypmxtadaagjp83itr9">
+        <w:t xml:space="preserve">   |   +353 85 887 3672   |   </w:t>
+      </w:r>
+      <w:hyperlink w:history="1" r:id="rIdgyxwq0yfldwvxnagti8th">
         <w:r>
           <w:rPr>
             <w:rStyle w:val="Hyperlink"/>
@@ -87,7 +79,7 @@
         </w:rPr>
         <w:t xml:space="preserve">Portfolio: </w:t>
       </w:r>
-      <w:hyperlink w:history="1" r:id="rId5a3rietho2scxyuofezr0">
+      <w:hyperlink w:history="1" r:id="rId9dfsre7b3ykchjnq-08hw">
         <w:r>
           <w:rPr>
             <w:rStyle w:val="Hyperlink"/>
@@ -103,9 +95,9 @@
           <w:sz w:val="17"/>
           <w:szCs w:val="17"/>
         </w:rPr>
-        <w:t xml:space="preserve">   •   LinkedIn: </w:t>
-      </w:r>
-      <w:hyperlink w:history="1" r:id="rIdnaapwei4yffd59fwwvnuo">
+        <w:t xml:space="preserve">   |   LinkedIn: </w:t>
+      </w:r>
+      <w:hyperlink w:history="1" r:id="rIdllixz0-ws8gbkqv_aod8q">
         <w:r>
           <w:rPr>
             <w:rStyle w:val="Hyperlink"/>
@@ -121,9 +113,9 @@
           <w:sz w:val="17"/>
           <w:szCs w:val="17"/>
         </w:rPr>
-        <w:t xml:space="preserve">   •   GitHub: </w:t>
-      </w:r>
-      <w:hyperlink w:history="1" r:id="rIds3vxqromjypdjjx09loff">
+        <w:t xml:space="preserve">   |   GitHub: </w:t>
+      </w:r>
+      <w:hyperlink w:history="1" r:id="rIdbvv3aku8lhzzzpx3fzln2">
         <w:r>
           <w:rPr>
             <w:rStyle w:val="Hyperlink"/>
@@ -164,7 +156,7 @@
           <w:sz w:val="19"/>
           <w:szCs w:val="19"/>
         </w:rPr>
-        <w:t xml:space="preserve">Solutions &amp; AI Architect with 15+ years in telecom and technology, now leading enterprise Generative AI. Ships production AI end to end — LLM integration (cloud and on-prem), RAG, and agentic systems (MCP, multi-agent pipelines) — on a foundation of deep BSS/OSS, network and silicon-level hardware experience. Core member of an AI Centre of Excellence, architect of a €200M fibre transformation serving 1M+ customers, and creator of three published AI developer tools. TOGAF-certified and AWS AI Practitioner; turns strategy into scalable, secure, business-impacting platforms.</w:t>
+        <w:t xml:space="preserve">Solutions and AI Architect with 15+ years in telecom and technology, now leading enterprise Generative AI. Ships production AI end to end, from LLM integration (cloud and on-prem) and RAG to agentic systems (MCP, multi-agent pipelines), on a foundation of deep BSS/OSS, network and silicon-level hardware experience. Core member of an AI Centre of Excellence, architect of a €200M fibre transformation serving 1M+ customers, and creator of three published AI developer tools. TOGAF certified and AWS AI Practitioner; turns strategy into scalable, secure, business-impacting platforms.</w:t>
       </w:r>
     </w:p>
     <w:p>
@@ -239,7 +231,7 @@
           <w:sz w:val="19"/>
           <w:szCs w:val="19"/>
         </w:rPr>
-        <w:t xml:space="preserve">Architected a RAG customer assistant — FAISS (migrated from ChromaDB) with Azure OpenAI embeddings and gpt-4o, hybrid proxy routing, graceful keyword fallback and source-cited answers.</w:t>
+        <w:t xml:space="preserve">Architected a RAG customer assistant using FAISS (migrated from ChromaDB) with Azure OpenAI embeddings and gpt-4o, hybrid proxy routing, graceful keyword fallback and source-cited answers.</w:t>
       </w:r>
     </w:p>
     <w:p>
@@ -295,7 +287,7 @@
           <w:sz w:val="19"/>
           <w:szCs w:val="19"/>
         </w:rPr>
-        <w:t xml:space="preserve">Designed UCIP — provider-routing LLM orchestration, on-prem GPU (A100/H100) serving via vLLM, GKE + Apigee, OAuth2/OIDC. First-hand silicon background (ARM/ATOM CPUs, Broadcom/PUMA SoCs) underpins this hardware-up approach to GPU compute.</w:t>
+        <w:t xml:space="preserve">Designed UCIP, a provider-routing LLM orchestration layer with on-prem GPU (A100/H100) serving via vLLM, GKE plus Apigee, and OAuth2/OIDC. First-hand silicon background (ARM/ATOM CPUs, Broadcom/PUMA SoCs) underpins this hardware-up approach to GPU compute.</w:t>
       </w:r>
     </w:p>
     <w:p>
@@ -329,7 +321,7 @@
           <w:sz w:val="19"/>
           <w:szCs w:val="19"/>
         </w:rPr>
-        <w:t xml:space="preserve">UCIP — Unified Customer Intelligence Platform</w:t>
+        <w:t xml:space="preserve">UCIP: Unified Customer Intelligence Platform</w:t>
       </w:r>
       <w:r>
         <w:rPr>
@@ -347,7 +339,7 @@
           <w:sz w:val="19"/>
           <w:szCs w:val="19"/>
         </w:rPr>
-        <w:t xml:space="preserve"> — API-first platform unifying three production apps into one customer-keyed intelligence layer for 1M+ customers; designed provider-routing LLM orchestration, an MCP tool surface, on-prem GPU (vLLM) inference and a GKE + Apigee migration with OAuth2/OIDC.</w:t>
+        <w:t xml:space="preserve">. API-first platform unifying three production apps into one customer-keyed intelligence layer for 1M+ customers; designed provider-routing LLM orchestration, an MCP tool surface, on-prem GPU (vLLM) inference and a GKE plus Apigee migration with OAuth2/OIDC.</w:t>
       </w:r>
     </w:p>
     <w:p>
@@ -380,7 +372,7 @@
           <w:sz w:val="19"/>
           <w:szCs w:val="19"/>
         </w:rPr>
-        <w:t xml:space="preserve"> — 360° contact-centre intelligence over Pega, ServiceNow, Qfiniti and Cisco data; architected the VIBO RAG assistant (FAISS + gpt-4o) with a resilient proxy, keyword fallback and source citations. FastAPI + React, cross-database identity resolution.</w:t>
+        <w:t xml:space="preserve">. 360-degree contact-centre intelligence over Pega, ServiceNow, Qfiniti and Cisco data. Architected the VIBO RAG assistant (FAISS plus gpt-4o) with a resilient proxy, keyword fallback and source citations. FastAPI and React, with cross-database identity resolution.</w:t>
       </w:r>
     </w:p>
     <w:p>
@@ -413,7 +405,7 @@
           <w:sz w:val="19"/>
           <w:szCs w:val="19"/>
         </w:rPr>
-        <w:t xml:space="preserve"> — Real-time contact-centre assistant — Azure OpenAI Whisper + GPT-4 on GCP for live agent suggestions and automated after-call work.</w:t>
+        <w:t xml:space="preserve">. Real-time contact-centre assistant using Azure OpenAI Whisper and GPT-4 on GCP for live agent suggestions and automated after-call work.</w:t>
       </w:r>
     </w:p>
     <w:p>
@@ -446,7 +438,7 @@
           <w:sz w:val="19"/>
           <w:szCs w:val="19"/>
         </w:rPr>
-        <w:t xml:space="preserve"> — AI field-dispatch engine recommending DISPATCH / CANCEL / REVIEW from network diagnostics, on an on-prem Qwen-32B model via vLLM; FastAPI + React + Redis/RQ.</w:t>
+        <w:t xml:space="preserve">. AI field-dispatch engine recommending DISPATCH, CANCEL or REVIEW from network diagnostics, running an on-prem Qwen-32B model via vLLM. FastAPI and React with Redis/RQ.</w:t>
       </w:r>
     </w:p>
     <w:p>
@@ -461,7 +453,7 @@
           <w:sz w:val="19"/>
           <w:szCs w:val="19"/>
         </w:rPr>
-        <w:t xml:space="preserve">RevSight — Mobile Revenue Assurance</w:t>
+        <w:t xml:space="preserve">RevSight: Mobile Revenue Assurance</w:t>
       </w:r>
       <w:r>
         <w:rPr>
@@ -479,7 +471,7 @@
           <w:sz w:val="19"/>
           <w:szCs w:val="19"/>
         </w:rPr>
-        <w:t xml:space="preserve"> — Mobile CDR revenue-leakage detection across 100+ countries; typed analytical marts over 4.3M+ records/month scaling to 90M+ rows, with daily validation controls.</w:t>
+        <w:t xml:space="preserve">. Mobile CDR revenue-leakage detection across 100+ countries. Typed analytical marts over 4.3M+ records per month scaling to 90M+ rows, with daily validation controls.</w:t>
       </w:r>
     </w:p>
     <w:p>
@@ -498,7 +490,7 @@
           <w:sz w:val="21"/>
           <w:szCs w:val="21"/>
         </w:rPr>
-        <w:t xml:space="preserve">AI DEVELOPER TOOLS — PUBLISHED</w:t>
+        <w:t xml:space="preserve">PUBLISHED AI DEVELOPER TOOLS</w:t>
       </w:r>
     </w:p>
     <w:p>
@@ -523,15 +515,15 @@
           <w:sz w:val="17"/>
           <w:szCs w:val="17"/>
         </w:rPr>
-        <w:t xml:space="preserve">  VS Code · junai-labs.junai</w:t>
-      </w:r>
-      <w:r>
-        <w:rPr>
-          <w:color w:val="222222"/>
-          <w:sz w:val="19"/>
-          <w:szCs w:val="19"/>
-        </w:rPr>
-        <w:t xml:space="preserve"> — Agentic pipeline for GitHub Copilot — 26 specialist agents, 9 MCP tools, deterministic stage routing.</w:t>
+        <w:t xml:space="preserve">  VS Code, junai-labs.junai</w:t>
+      </w:r>
+      <w:r>
+        <w:rPr>
+          <w:color w:val="222222"/>
+          <w:sz w:val="19"/>
+          <w:szCs w:val="19"/>
+        </w:rPr>
+        <w:t xml:space="preserve">. Agentic pipeline for GitHub Copilot with 26 specialist agents, 9 MCP tools and deterministic stage routing.</w:t>
       </w:r>
     </w:p>
     <w:p>
@@ -556,15 +548,15 @@
           <w:sz w:val="17"/>
           <w:szCs w:val="17"/>
         </w:rPr>
-        <w:t xml:space="preserve">  VS Code · junai-labs.ptarmigan</w:t>
-      </w:r>
-      <w:r>
-        <w:rPr>
-          <w:color w:val="222222"/>
-          <w:sz w:val="19"/>
-          <w:szCs w:val="19"/>
-        </w:rPr>
-        <w:t xml:space="preserve"> — TDD-enforced, gate-guarded agentic delivery system turning Copilot into a disciplined intent-to-ship pipeline.</w:t>
+        <w:t xml:space="preserve">  VS Code, junai-labs.ptarmigan</w:t>
+      </w:r>
+      <w:r>
+        <w:rPr>
+          <w:color w:val="222222"/>
+          <w:sz w:val="19"/>
+          <w:szCs w:val="19"/>
+        </w:rPr>
+        <w:t xml:space="preserve">. TDD-enforced, gate-guarded agentic delivery system that turns Copilot into a disciplined intent-to-ship pipeline.</w:t>
       </w:r>
     </w:p>
     <w:p>
@@ -597,7 +589,7 @@
           <w:sz w:val="19"/>
           <w:szCs w:val="19"/>
         </w:rPr>
-        <w:t xml:space="preserve"> — 5-stage development harness — 12 read-only agents, 130+ skills, model-portable via a LiteLLM gateway to local LLMs (vLLM / Ollama).</w:t>
+        <w:t xml:space="preserve">. 5-stage development harness with 12 read-only agents and 130+ skills, model-portable via a LiteLLM gateway to local LLMs (vLLM, Ollama).</w:t>
       </w:r>
     </w:p>
     <w:p>
@@ -622,7 +614,7 @@
     <w:p>
       <w:pPr>
         <w:tabs>
-          <w:tab w:val="right" w:pos="9300"/>
+          <w:tab w:val="right" w:pos="9746"/>
         </w:tabs>
         <w:spacing w:after="0" w:before="110"/>
       </w:pPr>
@@ -634,21 +626,21 @@
           <w:sz w:val="21"/>
           <w:szCs w:val="21"/>
         </w:rPr>
-        <w:t xml:space="preserve">Core Member — AI Centre of Excellence (CoE)</w:t>
-      </w:r>
-      <w:r>
-        <w:rPr>
-          <w:color w:val="555555"/>
-          <w:sz w:val="17"/>
-          <w:szCs w:val="17"/>
-        </w:rPr>
-        <w:t xml:space="preserve">	2025 – Present</w:t>
+        <w:t xml:space="preserve">Core Member, AI Centre of Excellence (CoE)</w:t>
+      </w:r>
+      <w:r>
+        <w:rPr>
+          <w:color w:val="555555"/>
+          <w:sz w:val="17"/>
+          <w:szCs w:val="17"/>
+        </w:rPr>
+        <w:t xml:space="preserve">	2025 to Present</w:t>
       </w:r>
     </w:p>
     <w:p>
       <w:pPr>
         <w:tabs>
-          <w:tab w:val="right" w:pos="9300"/>
+          <w:tab w:val="right" w:pos="9746"/>
         </w:tabs>
         <w:spacing w:after="50"/>
       </w:pPr>
@@ -688,7 +680,7 @@
           <w:sz w:val="19"/>
           <w:szCs w:val="19"/>
         </w:rPr>
-        <w:t xml:space="preserve">Core member of VMIE's AI Centre of Excellence since its inception — shaping enterprise AI strategy, governance and value-creation frameworks across business units.</w:t>
+        <w:t xml:space="preserve">Core member of VMIE's AI Centre of Excellence since its inception, shaping enterprise AI strategy, governance and value-creation frameworks across business units.</w:t>
       </w:r>
     </w:p>
     <w:p>
@@ -706,7 +698,7 @@
           <w:sz w:val="19"/>
           <w:szCs w:val="19"/>
         </w:rPr>
-        <w:t xml:space="preserve">Lead the design and delivery of production GenAI platforms — contact-centre AI assistants, RAG-based customer intelligence and AI-driven field dispatch.</w:t>
+        <w:t xml:space="preserve">Lead the design and delivery of production GenAI platforms: contact-centre AI assistants, RAG-based customer intelligence and AI-driven field dispatch.</w:t>
       </w:r>
     </w:p>
     <w:p>
@@ -724,13 +716,13 @@
           <w:sz w:val="19"/>
           <w:szCs w:val="19"/>
         </w:rPr>
-        <w:t xml:space="preserve">Define enterprise standards for LLM integration, RAG, agentic (MCP) systems and hybrid cloud / on-prem model serving.</w:t>
+        <w:t xml:space="preserve">Define enterprise standards for LLM integration, RAG, agentic (MCP) systems and hybrid cloud or on-prem model serving.</w:t>
       </w:r>
     </w:p>
     <w:p>
       <w:pPr>
         <w:tabs>
-          <w:tab w:val="right" w:pos="9300"/>
+          <w:tab w:val="right" w:pos="9746"/>
         </w:tabs>
         <w:spacing w:after="0" w:before="110"/>
       </w:pPr>
@@ -742,21 +734,21 @@
           <w:sz w:val="21"/>
           <w:szCs w:val="21"/>
         </w:rPr>
-        <w:t xml:space="preserve">Lead Solutions Architect — Architecture &amp; Transformation</w:t>
-      </w:r>
-      <w:r>
-        <w:rPr>
-          <w:color w:val="555555"/>
-          <w:sz w:val="17"/>
-          <w:szCs w:val="17"/>
-        </w:rPr>
-        <w:t xml:space="preserve">	Sep 2019 – Present</w:t>
+        <w:t xml:space="preserve">Lead Solutions Architect, Architecture &amp; Transformation</w:t>
+      </w:r>
+      <w:r>
+        <w:rPr>
+          <w:color w:val="555555"/>
+          <w:sz w:val="17"/>
+          <w:szCs w:val="17"/>
+        </w:rPr>
+        <w:t xml:space="preserve">	Sep 2019 to Present</w:t>
       </w:r>
     </w:p>
     <w:p>
       <w:pPr>
         <w:tabs>
-          <w:tab w:val="right" w:pos="9300"/>
+          <w:tab w:val="right" w:pos="9746"/>
         </w:tabs>
         <w:spacing w:after="50"/>
       </w:pPr>
@@ -796,7 +788,7 @@
           <w:sz w:val="19"/>
           <w:szCs w:val="19"/>
         </w:rPr>
-        <w:t xml:space="preserve">Architected end-to-end provisioning for the €200M fibre programme (HFC → XGS-PON) on GCP, from orchestration to cloud-based service activation.</w:t>
+        <w:t xml:space="preserve">Architected end-to-end provisioning for the €200M fibre programme (HFC to XGS-PON) on GCP, from orchestration to cloud-based service activation.</w:t>
       </w:r>
     </w:p>
     <w:p>
@@ -832,7 +824,7 @@
           <w:sz w:val="19"/>
           <w:szCs w:val="19"/>
         </w:rPr>
-        <w:t xml:space="preserve">Drove Contact Centre Transformation — replacing legacy Cisco IVR and Pega chat with a Genesys CCaaS omnichannel ecosystem; modernised operations with UiPath RPA and AI.</w:t>
+        <w:t xml:space="preserve">Drove Contact Centre Transformation, replacing legacy Cisco IVR and Pega chat with a Genesys CCaaS omnichannel ecosystem; modernised operations with UiPath RPA and AI.</w:t>
       </w:r>
     </w:p>
     <w:p>
@@ -856,7 +848,7 @@
     <w:p>
       <w:pPr>
         <w:tabs>
-          <w:tab w:val="right" w:pos="9300"/>
+          <w:tab w:val="right" w:pos="9746"/>
         </w:tabs>
         <w:spacing w:after="0" w:before="110"/>
       </w:pPr>
@@ -876,13 +868,13 @@
           <w:sz w:val="17"/>
           <w:szCs w:val="17"/>
         </w:rPr>
-        <w:t xml:space="preserve">	Sep 2018 – Jul 2019</w:t>
+        <w:t xml:space="preserve">	Sep 2018 to Jul 2019</w:t>
       </w:r>
     </w:p>
     <w:p>
       <w:pPr>
         <w:tabs>
-          <w:tab w:val="right" w:pos="9300"/>
+          <w:tab w:val="right" w:pos="9746"/>
         </w:tabs>
         <w:spacing w:after="50"/>
       </w:pPr>
@@ -940,7 +932,7 @@
           <w:sz w:val="19"/>
           <w:szCs w:val="19"/>
         </w:rPr>
-        <w:t xml:space="preserve">Discovered and resolved a critical bug — a security vulnerability in the Intel SDK — during DOCSIS 3.1 CPE manufacturing, saving several million euros and designing a strategic mitigation to future-proof operations.</w:t>
+        <w:t xml:space="preserve">Discovered and resolved a critical bug, a security vulnerability in the Intel SDK, during DOCSIS 3.1 CPE manufacturing, saving several million euros and designing a strategic mitigation to future-proof operations.</w:t>
       </w:r>
     </w:p>
     <w:p>
@@ -964,7 +956,7 @@
     <w:p>
       <w:pPr>
         <w:tabs>
-          <w:tab w:val="right" w:pos="9300"/>
+          <w:tab w:val="right" w:pos="9746"/>
         </w:tabs>
         <w:spacing w:after="0" w:before="110"/>
       </w:pPr>
@@ -984,13 +976,13 @@
           <w:sz w:val="17"/>
           <w:szCs w:val="17"/>
         </w:rPr>
-        <w:t xml:space="preserve">	Jan 2017 – Sep 2018</w:t>
+        <w:t xml:space="preserve">	Jan 2017 to Sep 2018</w:t>
       </w:r>
     </w:p>
     <w:p>
       <w:pPr>
         <w:tabs>
-          <w:tab w:val="right" w:pos="9300"/>
+          <w:tab w:val="right" w:pos="9746"/>
         </w:tabs>
         <w:spacing w:after="50"/>
       </w:pPr>
@@ -1030,13 +1022,13 @@
           <w:sz w:val="19"/>
           <w:szCs w:val="19"/>
         </w:rPr>
-        <w:t xml:space="preserve">Built CPE certification automation frameworks and represented Liberty Global in the RDK-B / TDK-B standards forum; ran a centralised modem farm for remote diagnostics.</w:t>
+        <w:t xml:space="preserve">Built CPE certification automation frameworks and represented Liberty Global in the RDK-B and TDK-B standards forum; ran a centralised modem farm for remote diagnostics.</w:t>
       </w:r>
     </w:p>
     <w:p>
       <w:pPr>
         <w:tabs>
-          <w:tab w:val="right" w:pos="9300"/>
+          <w:tab w:val="right" w:pos="9746"/>
         </w:tabs>
         <w:spacing w:after="0" w:before="110"/>
       </w:pPr>
@@ -1056,13 +1048,13 @@
           <w:sz w:val="17"/>
           <w:szCs w:val="17"/>
         </w:rPr>
-        <w:t xml:space="preserve">	Jul 2013 – Jan 2017</w:t>
+        <w:t xml:space="preserve">	Jul 2013 to Jan 2017</w:t>
       </w:r>
     </w:p>
     <w:p>
       <w:pPr>
         <w:tabs>
-          <w:tab w:val="right" w:pos="9300"/>
+          <w:tab w:val="right" w:pos="9746"/>
         </w:tabs>
         <w:spacing w:after="50"/>
       </w:pPr>
@@ -1102,7 +1094,7 @@
           <w:sz w:val="19"/>
           <w:szCs w:val="19"/>
         </w:rPr>
-        <w:t xml:space="preserve">Led the Mv1 cable modem launch in Ireland and provided expert 3rd-tier support — troubleshooting ARM/ATOM processors, Broadcom/PUMA chipsets and WiFi through log analysis and root-cause investigation.</w:t>
+        <w:t xml:space="preserve">Led the Mv1 cable modem launch in Ireland and provided expert 3rd-tier support, troubleshooting ARM/ATOM processors, Broadcom/PUMA chipsets and WiFi through log analysis and root-cause investigation.</w:t>
       </w:r>
     </w:p>
     <w:p>
@@ -1126,7 +1118,7 @@
     <w:p>
       <w:pPr>
         <w:tabs>
-          <w:tab w:val="right" w:pos="9300"/>
+          <w:tab w:val="right" w:pos="9746"/>
         </w:tabs>
         <w:spacing w:after="0" w:before="110"/>
       </w:pPr>
@@ -1146,13 +1138,13 @@
           <w:sz w:val="17"/>
           <w:szCs w:val="17"/>
         </w:rPr>
-        <w:t xml:space="preserve">	Feb 2008 – Jul 2013</w:t>
+        <w:t xml:space="preserve">	Feb 2008 to Jul 2013</w:t>
       </w:r>
     </w:p>
     <w:p>
       <w:pPr>
         <w:tabs>
-          <w:tab w:val="right" w:pos="9300"/>
+          <w:tab w:val="right" w:pos="9746"/>
         </w:tabs>
         <w:spacing w:after="50"/>
       </w:pPr>
@@ -1192,7 +1184,7 @@
           <w:sz w:val="19"/>
           <w:szCs w:val="19"/>
         </w:rPr>
-        <w:t xml:space="preserve">Grew the Technical Support Desk over five years as an SME — fault-trend analysis for broadband, VoIP and SIP, NOC monitoring, and team leadership and mentoring.</w:t>
+        <w:t xml:space="preserve">Grew the Technical Support Desk over five years as an SME, with fault-trend analysis for broadband, VoIP and SIP, NOC monitoring, and team leadership and mentoring.</w:t>
       </w:r>
     </w:p>
     <w:p>
@@ -1217,7 +1209,7 @@
     <w:p>
       <w:pPr>
         <w:tabs>
-          <w:tab w:val="right" w:pos="9300"/>
+          <w:tab w:val="right" w:pos="9746"/>
         </w:tabs>
         <w:spacing w:after="30"/>
       </w:pPr>
@@ -1237,21 +1229,21 @@
           <w:sz w:val="19"/>
           <w:szCs w:val="19"/>
         </w:rPr>
-        <w:t xml:space="preserve"> — Heriot-Watt University</w:t>
-      </w:r>
-      <w:r>
-        <w:rPr>
-          <w:color w:val="555555"/>
-          <w:sz w:val="17"/>
-          <w:szCs w:val="17"/>
-        </w:rPr>
-        <w:t xml:space="preserve">	2008 – 2011</w:t>
+        <w:t xml:space="preserve">, Heriot-Watt University</w:t>
+      </w:r>
+      <w:r>
+        <w:rPr>
+          <w:color w:val="555555"/>
+          <w:sz w:val="17"/>
+          <w:szCs w:val="17"/>
+        </w:rPr>
+        <w:t xml:space="preserve">	2008 to 2011</w:t>
       </w:r>
     </w:p>
     <w:p>
       <w:pPr>
         <w:tabs>
-          <w:tab w:val="right" w:pos="9300"/>
+          <w:tab w:val="right" w:pos="9746"/>
         </w:tabs>
         <w:spacing w:after="30"/>
       </w:pPr>
@@ -1271,15 +1263,15 @@
           <w:sz w:val="19"/>
           <w:szCs w:val="19"/>
         </w:rPr>
-        <w:t xml:space="preserve"> — Jawaharlal Nehru Technological University</w:t>
-      </w:r>
-      <w:r>
-        <w:rPr>
-          <w:color w:val="555555"/>
-          <w:sz w:val="17"/>
-          <w:szCs w:val="17"/>
-        </w:rPr>
-        <w:t xml:space="preserve">	2003 – 2007</w:t>
+        <w:t xml:space="preserve">, Jawaharlal Nehru Technological University</w:t>
+      </w:r>
+      <w:r>
+        <w:rPr>
+          <w:color w:val="555555"/>
+          <w:sz w:val="17"/>
+          <w:szCs w:val="17"/>
+        </w:rPr>
+        <w:t xml:space="preserve">	2003 to 2007</w:t>
       </w:r>
     </w:p>
     <w:p>
@@ -1311,7 +1303,7 @@
           <w:sz w:val="19"/>
           <w:szCs w:val="19"/>
         </w:rPr>
-        <w:t xml:space="preserve">AWS Certified AI Practitioner (2025)  •  Develop AI-Powered Prototypes, Google AI Studio (2025)  •  Northstar – Snowflake Intelligence (2025)  •  TOGAF® 9 Certified (2021)  •  Postman API Fundamentals Student Expert (2023)  •  Certified Tester Foundation Level, CTFL (2018)</w:t>
+        <w:t xml:space="preserve">AWS Certified AI Practitioner (2025)  |  Develop AI-Powered Prototypes, Google AI Studio (2025)  |  Northstar, Snowflake Intelligence (2025)  |  TOGAF 9 Certified (2021)  |  Postman API Fundamentals Student Expert (2023)  |  Certified Tester Foundation Level, CTFL (2018)</w:t>
       </w:r>
     </w:p>
     <w:p>
@@ -1399,7 +1391,7 @@
           <w:sz w:val="19"/>
           <w:szCs w:val="19"/>
         </w:rPr>
-        <w:t xml:space="preserve">FAISS &amp; ChromaDB, LiteLLM gateway, in-app observability; GCP (GKE, Apigee), AWS, Snowflake, Docker / Kubernetes, Redis, CI/CD</w:t>
+        <w:t xml:space="preserve">FAISS, ChromaDB, LiteLLM gateway, in-app observability; GCP (GKE, Apigee), AWS, Snowflake, Docker, Kubernetes, Redis, CI/CD</w:t>
       </w:r>
     </w:p>
     <w:p>
@@ -1422,7 +1414,7 @@
           <w:sz w:val="19"/>
           <w:szCs w:val="19"/>
         </w:rPr>
-        <w:t xml:space="preserve">Python, FastAPI, SQLAlchemy, React, TypeScript, SQL Server, REST / TM Forum Open API</w:t>
+        <w:t xml:space="preserve">Python, FastAPI, SQLAlchemy, React, TypeScript, SQL Server, REST, TM Forum Open API</w:t>
       </w:r>
     </w:p>
     <w:p>
@@ -1445,7 +1437,7 @@
           <w:sz w:val="19"/>
           <w:szCs w:val="19"/>
         </w:rPr>
-        <w:t xml:space="preserve">TOGAF, enterprise &amp; solution architecture, microservices, BSS/OSS, XGS-PON / DOCSIS; ARM/ATOM &amp; Broadcom/PUMA silicon, on-prem GPU (A100/H100)</w:t>
+        <w:t xml:space="preserve">TOGAF, enterprise and solution architecture, microservices, BSS/OSS, XGS-PON, DOCSIS; ARM/ATOM and Broadcom/PUMA silicon, on-prem GPU (A100/H100)</w:t>
       </w:r>
     </w:p>
     <w:p>
@@ -1468,7 +1460,7 @@
           <w:sz w:val="19"/>
           <w:szCs w:val="19"/>
         </w:rPr>
-        <w:t xml:space="preserve">Cerillion, Clarify, Ciena BluePlanet, PEGA, Zira, Nokia AAA / Altiplano, Salesforce, ServiceNow, Genesys</w:t>
+        <w:t xml:space="preserve">Cerillion, Clarify, Ciena BluePlanet, PEGA, Zira, Nokia AAA, Altiplano, Salesforce, ServiceNow, Genesys</w:t>
       </w:r>
     </w:p>
     <w:p>
@@ -1492,15 +1484,15 @@
     </w:p>
     <w:p>
       <w:pPr>
-        <w:spacing w:after="0"/>
-      </w:pPr>
-      <w:r>
-        <w:rPr>
-          <w:color w:val="222222"/>
-          <w:sz w:val="19"/>
-          <w:szCs w:val="19"/>
-        </w:rPr>
-        <w:t xml:space="preserve">Star Techie Award and Unsung Hero Award — Virgin Media Ireland, for exceptional technical contribution and consistent outstanding delivery.</w:t>
+        <w:spacing w:after="40"/>
+      </w:pPr>
+      <w:r>
+        <w:rPr>
+          <w:color w:val="222222"/>
+          <w:sz w:val="19"/>
+          <w:szCs w:val="19"/>
+        </w:rPr>
+        <w:t xml:space="preserve">Star Techie Award and Unsung Hero Award (Virgin Media Ireland), for exceptional technical contribution and consistent outstanding delivery.</w:t>
       </w:r>
     </w:p>
     <w:sectPr>

</xml_diff>

<commit_message>
Fix CV wording nits; add PDF downloads for direct job applications
- TOGAF 9 in summary; 'Northstar: Snowflake Intelligence' in certs
- Resume/footer downloads now serve PDF (2-page and 3-page)

Co-Authored-By: Claude Opus 4.8 <noreply@anthropic.com>
</commit_message>
<xml_diff>
--- a/public/Junaid_Shaik_AI_Solutions_Lead_CV.docx
+++ b/public/Junaid_Shaik_AI_Solutions_Lead_CV.docx
@@ -51,7 +51,7 @@
         </w:rPr>
         <w:t xml:space="preserve">   |   +353 85 887 3672   |   </w:t>
       </w:r>
-      <w:hyperlink w:history="1" r:id="rIdgyxwq0yfldwvxnagti8th">
+      <w:hyperlink w:history="1" r:id="rIdqpq7qfzvsixt7svaezjoy">
         <w:r>
           <w:rPr>
             <w:rStyle w:val="Hyperlink"/>
@@ -79,7 +79,7 @@
         </w:rPr>
         <w:t xml:space="preserve">Portfolio: </w:t>
       </w:r>
-      <w:hyperlink w:history="1" r:id="rId9dfsre7b3ykchjnq-08hw">
+      <w:hyperlink w:history="1" r:id="rIdqvg-9zg38gwjmqm4-upax">
         <w:r>
           <w:rPr>
             <w:rStyle w:val="Hyperlink"/>
@@ -97,7 +97,7 @@
         </w:rPr>
         <w:t xml:space="preserve">   |   LinkedIn: </w:t>
       </w:r>
-      <w:hyperlink w:history="1" r:id="rIdllixz0-ws8gbkqv_aod8q">
+      <w:hyperlink w:history="1" r:id="rIddyfjaxihcflyzltx64nor">
         <w:r>
           <w:rPr>
             <w:rStyle w:val="Hyperlink"/>
@@ -115,7 +115,7 @@
         </w:rPr>
         <w:t xml:space="preserve">   |   GitHub: </w:t>
       </w:r>
-      <w:hyperlink w:history="1" r:id="rIdbvv3aku8lhzzzpx3fzln2">
+      <w:hyperlink w:history="1" r:id="rIdix5c2hov_qoyhl6axuels">
         <w:r>
           <w:rPr>
             <w:rStyle w:val="Hyperlink"/>
@@ -156,7 +156,7 @@
           <w:sz w:val="19"/>
           <w:szCs w:val="19"/>
         </w:rPr>
-        <w:t xml:space="preserve">Solutions and AI Architect with 15+ years in telecom and technology, now leading enterprise Generative AI. Ships production AI end to end, from LLM integration (cloud and on-prem) and RAG to agentic systems (MCP, multi-agent pipelines), on a foundation of deep BSS/OSS, network and silicon-level hardware experience. Core member of an AI Centre of Excellence, architect of a €200M fibre transformation serving 1M+ customers, and creator of three published AI developer tools. TOGAF certified and AWS AI Practitioner; turns strategy into scalable, secure, business-impacting platforms.</w:t>
+        <w:t xml:space="preserve">Solutions and AI Architect with 15+ years in telecom and technology, now leading enterprise Generative AI. Ships production AI end to end, from LLM integration (cloud and on-prem) and RAG to agentic systems (MCP, multi-agent pipelines), on a foundation of deep BSS/OSS, network and silicon-level hardware experience. Core member of an AI Centre of Excellence, architect of a €200M fibre transformation serving 1M+ customers, and creator of three published AI developer tools. TOGAF 9 certified and AWS AI Practitioner; turns strategy into scalable, secure, business-impacting platforms.</w:t>
       </w:r>
     </w:p>
     <w:p>
@@ -1303,7 +1303,7 @@
           <w:sz w:val="19"/>
           <w:szCs w:val="19"/>
         </w:rPr>
-        <w:t xml:space="preserve">AWS Certified AI Practitioner (2025)  |  Develop AI-Powered Prototypes, Google AI Studio (2025)  |  Northstar, Snowflake Intelligence (2025)  |  TOGAF 9 Certified (2021)  |  Postman API Fundamentals Student Expert (2023)  |  Certified Tester Foundation Level, CTFL (2018)</w:t>
+        <w:t xml:space="preserve">AWS Certified AI Practitioner (2025)  |  Develop AI-Powered Prototypes, Google AI Studio (2025)  |  Northstar: Snowflake Intelligence (2025)  |  TOGAF 9 Certified (2021)  |  Postman API Fundamentals Student Expert (2023)  |  Certified Tester Foundation Level, CTFL (2018)</w:t>
       </w:r>
     </w:p>
     <w:p>

</xml_diff>